<commit_message>
Feat: script di inizializzazione. Fix: typos
</commit_message>
<xml_diff>
--- a/docs/rettifiche/rettifica-v0.1.1.docx
+++ b/docs/rettifiche/rettifica-v0.1.1.docx
@@ -54,7 +54,6 @@
           <w:rFonts w:ascii="Times New Roman" w:hAnsi="Times New Roman" w:cs="Times New Roman"/>
           <w:sz w:val="36"/>
           <w:szCs w:val="36"/>
-          <w:lang w:val="en-US"/>
         </w:rPr>
       </w:pPr>
     </w:p>
@@ -517,7 +516,25 @@
           <w:sz w:val="36"/>
           <w:szCs w:val="36"/>
         </w:rPr>
-        <w:t>l campo pfp (</w:t>
+        <w:t xml:space="preserve">l campo </w:t>
+      </w:r>
+      <w:proofErr w:type="spellStart"/>
+      <w:r>
+        <w:rPr>
+          <w:rFonts w:ascii="Times New Roman" w:hAnsi="Times New Roman" w:cs="Times New Roman"/>
+          <w:sz w:val="36"/>
+          <w:szCs w:val="36"/>
+        </w:rPr>
+        <w:t>pfp</w:t>
+      </w:r>
+      <w:proofErr w:type="spellEnd"/>
+      <w:r>
+        <w:rPr>
+          <w:rFonts w:ascii="Times New Roman" w:hAnsi="Times New Roman" w:cs="Times New Roman"/>
+          <w:sz w:val="36"/>
+          <w:szCs w:val="36"/>
+        </w:rPr>
+        <w:t xml:space="preserve"> (</w:t>
       </w:r>
       <w:proofErr w:type="spellStart"/>
       <w:r>
@@ -826,45 +843,6 @@
         </w:rPr>
         <w:t>.</w:t>
       </w:r>
-    </w:p>
-    <w:p>
-      <w:pPr>
-        <w:pBdr>
-          <w:bottom w:val="single" w:sz="6" w:space="1" w:color="auto"/>
-        </w:pBdr>
-        <w:spacing w:line="240" w:lineRule="auto"/>
-        <w:contextualSpacing/>
-        <w:rPr>
-          <w:rFonts w:ascii="Times New Roman" w:hAnsi="Times New Roman" w:cs="Times New Roman"/>
-          <w:sz w:val="36"/>
-          <w:szCs w:val="36"/>
-          <w:lang w:val="en-US"/>
-        </w:rPr>
-      </w:pPr>
-    </w:p>
-    <w:p>
-      <w:pPr>
-        <w:spacing w:line="240" w:lineRule="auto"/>
-        <w:contextualSpacing/>
-        <w:rPr>
-          <w:rFonts w:ascii="Times New Roman" w:hAnsi="Times New Roman" w:cs="Times New Roman"/>
-          <w:sz w:val="36"/>
-          <w:szCs w:val="36"/>
-          <w:lang w:val="en-US"/>
-        </w:rPr>
-      </w:pPr>
-    </w:p>
-    <w:p>
-      <w:pPr>
-        <w:spacing w:line="240" w:lineRule="auto"/>
-        <w:contextualSpacing/>
-        <w:rPr>
-          <w:rFonts w:ascii="Times New Roman" w:hAnsi="Times New Roman" w:cs="Times New Roman"/>
-          <w:sz w:val="36"/>
-          <w:szCs w:val="36"/>
-          <w:lang w:val="en-US"/>
-        </w:rPr>
-      </w:pPr>
     </w:p>
     <w:sectPr>
       <w:pgSz w:w="11906" w:h="16838"/>

</xml_diff>